<commit_message>
docs: regenerate resubmission cover letter and create submission package zip
Co-Authored-By: Tatsuki Onishi <bougtoir@gmail.com>
</commit_message>
<xml_diff>
--- a/vaporizer-price-study/papers/jatm_cover_letter.docx
+++ b/vaporizer-price-study/papers/jatm_cover_letter.docx
@@ -4,7 +4,7 @@
   <w:body>
     <w:p>
       <w:r>
-        <w:t>June 26, 2026</w:t>
+        <w:t>July 29, 2026</w:t>
       </w:r>
     </w:p>
     <w:p/>
@@ -27,22 +27,17 @@
     <w:p/>
     <w:p>
       <w:r>
-        <w:t>We are pleased to submit our manuscript entitled "Targeted environmental regulation without observable collateral market damage: the EU desflurane ban and secondary market vaporizer prices" for consideration as an Article in the Journal of Anesthesia and Translational Medicine.</w:t>
+        <w:t>We are resubmitting our revised manuscript entitled "Targeted environmental regulation and secondary market vaporizer prices: an observational analysis of the EU desflurane phase-out" (Manuscript Number JATMED-D-26-00064) for reconsideration as an Article in the Journal of Anesthesia and Translational Medicine.</w:t>
       </w:r>
     </w:p>
     <w:p>
       <w:r>
-        <w:t>Environmental regulation of anesthetic agents is accelerating globally, yet the downstream economic consequences for clinical equipment markets remain largely unknown. Using three years of eBay completed sale data (March 2023 to March 2026) spanning the full EU desflurane regulatory timeline, we provide the first empirical evidence on this question. We found that desflurane vaporizer prices showed a progressive, statistically significant decline (Spearman ρ=−0.28, P&lt;0.001), while sevoflurane and isoflurane vaporizer prices remained stable throughout the study period. Between-agent effect size comparison confirmed the agent-specificity of this decline (P=0.043). These findings suggest that the EU’s targeted regulation achieved its intended market-level effects without observable destabilization of the broader anesthetic equipment market.</w:t>
+        <w:t>We thank the Editor and the two reviewers for their constructive feedback. In this revision we have (1) added sensitivity and control-series analyses including bootstrap resampling, post-hoc power simulation, a comparative interrupted time-series model, and a transaction-level difference-in-differences analysis; (2) softened the causal interpretation throughout and replaced "ban/prohibited" with accurate wording about a restriction on routine use with documented clinical exceptions; (3) expanded the clinical and environmental context, including desflurane pharmacokinetic advantages, the debate over GWP100 for short-lived anesthetics, and the importance of anesthetic diversity for supply-chain resilience; and (4) strengthened the limitations section regarding confounders, eBay generalizability, EU/non-EU transaction uncertainty, and the small post-restriction sample. A detailed point-by-point response to reviewers is enclosed.</w:t>
       </w:r>
     </w:p>
     <w:p>
       <w:r>
-        <w:t>We believe this work is particularly relevant to the readership of your journal for several reasons. First, as the official journal of the Chinese Society of Anesthesiology, JATM reaches a broad international audience of anesthesiologists and perioperative physicians who are navigating similar regulatory transitions worldwide. Second, the translational implications of our findings—bridging environmental policy and clinical equipment economics—align well with the journal’s emphasis on translational medicine in anesthesiology. Third, the finding that secondary market values depreciate well before formal prohibition dates has direct implications for capital asset management and transition planning in anesthesia departments globally, including in regions considering similar regulations.</w:t>
-      </w:r>
-    </w:p>
-    <w:p>
-      <w:r>
-        <w:t>The manuscript has not been published previously and is not under consideration by any other journal. All authors have approved the manuscript and agree with its submission to the Journal of Anesthesia and Translational Medicine.</w:t>
+        <w:t>The manuscript has not been published previously and is not under consideration by any other journal. All authors have approved the revised manuscript and agree with its resubmission to the Journal of Anesthesia and Translational Medicine.</w:t>
       </w:r>
     </w:p>
     <w:p>

</xml_diff>

<commit_message>
Regenerate JATM tables, figures, strobe, and cover letter with updated author details
Co-Authored-By: Tatsuki Onishi <bougtoir@gmail.com>
</commit_message>
<xml_diff>
--- a/vaporizer-price-study/papers/jatm_cover_letter.docx
+++ b/vaporizer-price-study/papers/jatm_cover_letter.docx
@@ -27,12 +27,12 @@
     <w:p/>
     <w:p>
       <w:r>
-        <w:t>We are resubmitting our revised manuscript entitled "Targeted environmental regulation and secondary market vaporizer prices: an observational analysis of the EU desflurane phase-out" (Manuscript Number JATMED-D-26-00064) for reconsideration as an Article in the Journal of Anesthesia and Translational Medicine.</w:t>
+        <w:t>We are resubmitting our revised manuscript entitled "Association between the EU desflurane phase-out and secondary market vaporizer prices: an observational time-series analysis" (Manuscript Number JATMED-D-26-00064R1) for reconsideration as an Article in the Journal of Anesthesia and Translational Medicine.</w:t>
       </w:r>
     </w:p>
     <w:p>
       <w:r>
-        <w:t>We thank the Editor and the two reviewers for their constructive feedback. In this revision we have (1) added sensitivity and control-series analyses including bootstrap resampling, post-hoc power simulation, a comparative interrupted time-series model, and a transaction-level difference-in-differences analysis; (2) softened the causal interpretation throughout and replaced "ban/prohibited" with accurate wording about a restriction on routine use with documented clinical exceptions; (3) expanded the clinical and environmental context, including desflurane pharmacokinetic advantages, the debate over GWP100 for short-lived anesthetics, and the importance of anesthetic diversity for supply-chain resilience; and (4) strengthened the limitations section regarding confounders, eBay generalizability, EU/non-EU transaction uncertainty, and the small post-restriction sample. A detailed point-by-point response to reviewers is enclosed.</w:t>
+        <w:t>We thank the Editor and the two reviewers for their constructive feedback. In this minor revision we have (1) further softened the causal language in the title and abstract; (2) clarified that the short post-restriction window reflects the Terapeak three-year historical window ending at data extraction in March 2026; (3) explicitly interpreted the non-significant transaction-level DiD post-restriction coefficient in light of a violated parallel-trend assumption; and (4) added an acknowledgment that trend tests across three agents raise a multiple-testing concern, with isoflurane reaching nominal significance in two transaction-level tests but not in the quarterly median analysis and with small effect sizes. A detailed point-by-point response to reviewers is enclosed.</w:t>
       </w:r>
     </w:p>
     <w:p>
@@ -54,22 +54,22 @@
     <w:p/>
     <w:p>
       <w:r>
-        <w:t>[Corresponding author name]</w:t>
+        <w:t>Onishi Tatsuki</w:t>
       </w:r>
     </w:p>
     <w:p>
       <w:r>
-        <w:t>[Department, Institution]</w:t>
+        <w:t>Data Science and AI Innovation Research Promotion Center, Shiga University</w:t>
       </w:r>
     </w:p>
     <w:p>
       <w:r>
-        <w:t>[Address]</w:t>
+        <w:t>1-1-1, Bamba, Hikone, Shiga, 522-8522, Japan</w:t>
       </w:r>
     </w:p>
     <w:p>
       <w:r>
-        <w:t>[Email]</w:t>
+        <w:t>E-mail: bougtoir@gmail.com</w:t>
       </w:r>
     </w:p>
     <w:sectPr>

</xml_diff>